<commit_message>
Add 5A cumulative-count intensity (lndid_cont) robustness; combine with 5A-only and 4A columns
lndid_cont was missing from the modular do files. Add it to 03_robustness
5.5 and present it in one table with the 5A-treated-only and 4A-replacement
columns. Note honestly that with the placeholder num5a_new (first-year=1),
cumulative count is binary so lndid_cont (-0.149***) is the baseline
rescaled, not a true dose-response; a real yearly-new-5A count is needed.

Co-Authored-By: Claude Opus 4.8 <noreply@anthropic.com>
Claude-Session: https://claude.ai/code/session_01FZDJip15REdPSWovBw2et4
</commit_message>
<xml_diff>
--- a/减污降碳_实证结果整理稿_0706合并.docx
+++ b/减污降碳_实证结果整理稿_0706合并.docx
@@ -6061,7 +6061,7 @@
           <w:b/>
           <w:sz w:val="21"/>
         </w:rPr>
-        <w:t>表7  识别稳健性：替换核心解释变量(4A)</w:t>
+        <w:t>表7  识别稳健性：替换核心解释变量（5A数量强度 / 4A）</w:t>
       </w:r>
     </w:p>
     <w:tbl>
@@ -6071,15 +6071,16 @@
         <w:tblLook w:firstColumn="1" w:firstRow="1" w:lastColumn="0" w:lastRow="0" w:noHBand="0" w:noVBand="1" w:val="04A0"/>
       </w:tblPr>
       <w:tblGrid>
-        <w:gridCol w:w="2160"/>
-        <w:gridCol w:w="2160"/>
-        <w:gridCol w:w="2160"/>
-        <w:gridCol w:w="2160"/>
+        <w:gridCol w:w="1728"/>
+        <w:gridCol w:w="1728"/>
+        <w:gridCol w:w="1728"/>
+        <w:gridCol w:w="1728"/>
+        <w:gridCol w:w="1728"/>
       </w:tblGrid>
       <w:tr>
         <w:tc>
           <w:tcPr>
-            <w:tcW w:type="dxa" w:w="2160"/>
+            <w:tcW w:type="dxa" w:w="1728"/>
             <w:tcBorders>
               <w:top w:val="single" w:sz="14" w:color="000000"/>
               <w:bottom w:val="single" w:sz="6" w:color="000000"/>
@@ -6102,7 +6103,7 @@
         </w:tc>
         <w:tc>
           <w:tcPr>
-            <w:tcW w:type="dxa" w:w="2160"/>
+            <w:tcW w:type="dxa" w:w="1728"/>
             <w:tcBorders>
               <w:top w:val="single" w:sz="14" w:color="000000"/>
               <w:bottom w:val="single" w:sz="6" w:color="000000"/>
@@ -6125,7 +6126,7 @@
         </w:tc>
         <w:tc>
           <w:tcPr>
-            <w:tcW w:type="dxa" w:w="2160"/>
+            <w:tcW w:type="dxa" w:w="1728"/>
             <w:tcBorders>
               <w:top w:val="single" w:sz="14" w:color="000000"/>
               <w:bottom w:val="single" w:sz="6" w:color="000000"/>
@@ -6142,13 +6143,13 @@
                 <w:b/>
                 <w:sz w:val="17"/>
               </w:rPr>
-              <w:t>4A替换·全样本</w:t>
-            </w:r>
-          </w:p>
-        </w:tc>
-        <w:tc>
-          <w:tcPr>
-            <w:tcW w:type="dxa" w:w="2160"/>
+              <w:t>5A累计数量强度</w:t>
+            </w:r>
+          </w:p>
+        </w:tc>
+        <w:tc>
+          <w:tcPr>
+            <w:tcW w:type="dxa" w:w="1728"/>
             <w:tcBorders>
               <w:top w:val="single" w:sz="14" w:color="000000"/>
               <w:bottom w:val="single" w:sz="6" w:color="000000"/>
@@ -6165,6 +6166,29 @@
                 <w:b/>
                 <w:sz w:val="17"/>
               </w:rPr>
+              <w:t>4A替换·全样本</w:t>
+            </w:r>
+          </w:p>
+        </w:tc>
+        <w:tc>
+          <w:tcPr>
+            <w:tcW w:type="dxa" w:w="1728"/>
+            <w:tcBorders>
+              <w:top w:val="single" w:sz="14" w:color="000000"/>
+              <w:bottom w:val="single" w:sz="6" w:color="000000"/>
+            </w:tcBorders>
+          </w:tcPr>
+          <w:p>
+            <w:pPr>
+              <w:spacing w:after="0" w:before="0"/>
+              <w:jc w:val="center"/>
+            </w:pPr>
+            <w:r>
+              <w:rPr>
+                <w:rFonts w:ascii="Times New Roman" w:hAnsi="Times New Roman" w:eastAsia="宋体"/>
+                <w:b/>
+                <w:sz w:val="17"/>
+              </w:rPr>
               <w:t>4A替换·干净对照</w:t>
             </w:r>
           </w:p>
@@ -6173,7 +6197,7 @@
       <w:tr>
         <w:tc>
           <w:tcPr>
-            <w:tcW w:type="dxa" w:w="2160"/>
+            <w:tcW w:type="dxa" w:w="1728"/>
           </w:tcPr>
           <w:p>
             <w:pPr>
@@ -6191,7 +6215,7 @@
         </w:tc>
         <w:tc>
           <w:tcPr>
-            <w:tcW w:type="dxa" w:w="2160"/>
+            <w:tcW w:type="dxa" w:w="1728"/>
           </w:tcPr>
           <w:p>
             <w:pPr>
@@ -6209,24 +6233,41 @@
         </w:tc>
         <w:tc>
           <w:tcPr>
-            <w:tcW w:type="dxa" w:w="2160"/>
-          </w:tcPr>
-          <w:p>
-            <w:pPr>
-              <w:spacing w:after="0" w:before="0"/>
-              <w:jc w:val="center"/>
-            </w:pPr>
-            <w:r>
-              <w:rPr>
-                <w:rFonts w:ascii="Times New Roman" w:hAnsi="Times New Roman" w:eastAsia="宋体"/>
-                <w:sz w:val="17"/>
-              </w:rPr>
-            </w:r>
-          </w:p>
-        </w:tc>
-        <w:tc>
-          <w:tcPr>
-            <w:tcW w:type="dxa" w:w="2160"/>
+            <w:tcW w:type="dxa" w:w="1728"/>
+          </w:tcPr>
+          <w:p>
+            <w:pPr>
+              <w:spacing w:after="0" w:before="0"/>
+              <w:jc w:val="center"/>
+            </w:pPr>
+            <w:r>
+              <w:rPr>
+                <w:rFonts w:ascii="Times New Roman" w:hAnsi="Times New Roman" w:eastAsia="宋体"/>
+                <w:sz w:val="17"/>
+              </w:rPr>
+            </w:r>
+          </w:p>
+        </w:tc>
+        <w:tc>
+          <w:tcPr>
+            <w:tcW w:type="dxa" w:w="1728"/>
+          </w:tcPr>
+          <w:p>
+            <w:pPr>
+              <w:spacing w:after="0" w:before="0"/>
+              <w:jc w:val="center"/>
+            </w:pPr>
+            <w:r>
+              <w:rPr>
+                <w:rFonts w:ascii="Times New Roman" w:hAnsi="Times New Roman" w:eastAsia="宋体"/>
+                <w:sz w:val="17"/>
+              </w:rPr>
+            </w:r>
+          </w:p>
+        </w:tc>
+        <w:tc>
+          <w:tcPr>
+            <w:tcW w:type="dxa" w:w="1728"/>
           </w:tcPr>
           <w:p>
             <w:pPr>
@@ -6245,7 +6286,7 @@
       <w:tr>
         <w:tc>
           <w:tcPr>
-            <w:tcW w:type="dxa" w:w="2160"/>
+            <w:tcW w:type="dxa" w:w="1728"/>
           </w:tcPr>
           <w:p>
             <w:pPr>
@@ -6262,7 +6303,7 @@
         </w:tc>
         <w:tc>
           <w:tcPr>
-            <w:tcW w:type="dxa" w:w="2160"/>
+            <w:tcW w:type="dxa" w:w="1728"/>
           </w:tcPr>
           <w:p>
             <w:pPr>
@@ -6280,24 +6321,41 @@
         </w:tc>
         <w:tc>
           <w:tcPr>
-            <w:tcW w:type="dxa" w:w="2160"/>
-          </w:tcPr>
-          <w:p>
-            <w:pPr>
-              <w:spacing w:after="0" w:before="0"/>
-              <w:jc w:val="center"/>
-            </w:pPr>
-            <w:r>
-              <w:rPr>
-                <w:rFonts w:ascii="Times New Roman" w:hAnsi="Times New Roman" w:eastAsia="宋体"/>
-                <w:sz w:val="17"/>
-              </w:rPr>
-            </w:r>
-          </w:p>
-        </w:tc>
-        <w:tc>
-          <w:tcPr>
-            <w:tcW w:type="dxa" w:w="2160"/>
+            <w:tcW w:type="dxa" w:w="1728"/>
+          </w:tcPr>
+          <w:p>
+            <w:pPr>
+              <w:spacing w:after="0" w:before="0"/>
+              <w:jc w:val="center"/>
+            </w:pPr>
+            <w:r>
+              <w:rPr>
+                <w:rFonts w:ascii="Times New Roman" w:hAnsi="Times New Roman" w:eastAsia="宋体"/>
+                <w:sz w:val="17"/>
+              </w:rPr>
+            </w:r>
+          </w:p>
+        </w:tc>
+        <w:tc>
+          <w:tcPr>
+            <w:tcW w:type="dxa" w:w="1728"/>
+          </w:tcPr>
+          <w:p>
+            <w:pPr>
+              <w:spacing w:after="0" w:before="0"/>
+              <w:jc w:val="center"/>
+            </w:pPr>
+            <w:r>
+              <w:rPr>
+                <w:rFonts w:ascii="Times New Roman" w:hAnsi="Times New Roman" w:eastAsia="宋体"/>
+                <w:sz w:val="17"/>
+              </w:rPr>
+            </w:r>
+          </w:p>
+        </w:tc>
+        <w:tc>
+          <w:tcPr>
+            <w:tcW w:type="dxa" w:w="1728"/>
           </w:tcPr>
           <w:p>
             <w:pPr>
@@ -6316,7 +6374,7 @@
       <w:tr>
         <w:tc>
           <w:tcPr>
-            <w:tcW w:type="dxa" w:w="2160"/>
+            <w:tcW w:type="dxa" w:w="1728"/>
           </w:tcPr>
           <w:p>
             <w:pPr>
@@ -6328,60 +6386,76 @@
                 <w:rFonts w:ascii="Times New Roman" w:hAnsi="Times New Roman" w:eastAsia="宋体"/>
                 <w:sz w:val="17"/>
               </w:rPr>
-              <w:t>4A政策(DID4A)</w:t>
-            </w:r>
-          </w:p>
-        </w:tc>
-        <w:tc>
-          <w:tcPr>
-            <w:tcW w:type="dxa" w:w="2160"/>
-          </w:tcPr>
-          <w:p>
-            <w:pPr>
-              <w:spacing w:after="0" w:before="0"/>
-              <w:jc w:val="center"/>
-            </w:pPr>
-            <w:r>
-              <w:rPr>
-                <w:rFonts w:ascii="Times New Roman" w:hAnsi="Times New Roman" w:eastAsia="宋体"/>
-                <w:sz w:val="17"/>
-              </w:rPr>
-            </w:r>
-          </w:p>
-        </w:tc>
-        <w:tc>
-          <w:tcPr>
-            <w:tcW w:type="dxa" w:w="2160"/>
-          </w:tcPr>
-          <w:p>
-            <w:pPr>
-              <w:spacing w:after="0" w:before="0"/>
-              <w:jc w:val="center"/>
-            </w:pPr>
-            <w:r>
-              <w:rPr>
-                <w:rFonts w:ascii="Times New Roman" w:hAnsi="Times New Roman" w:eastAsia="宋体"/>
-                <w:sz w:val="17"/>
-              </w:rPr>
-              <w:t>-0.061</w:t>
-            </w:r>
-          </w:p>
-        </w:tc>
-        <w:tc>
-          <w:tcPr>
-            <w:tcW w:type="dxa" w:w="2160"/>
-          </w:tcPr>
-          <w:p>
-            <w:pPr>
-              <w:spacing w:after="0" w:before="0"/>
-              <w:jc w:val="center"/>
-            </w:pPr>
-            <w:r>
-              <w:rPr>
-                <w:rFonts w:ascii="Times New Roman" w:hAnsi="Times New Roman" w:eastAsia="宋体"/>
-                <w:sz w:val="17"/>
-              </w:rPr>
-              <w:t>-0.117</w:t>
+              <w:t>5A累计数量强度</w:t>
+            </w:r>
+          </w:p>
+        </w:tc>
+        <w:tc>
+          <w:tcPr>
+            <w:tcW w:type="dxa" w:w="1728"/>
+          </w:tcPr>
+          <w:p>
+            <w:pPr>
+              <w:spacing w:after="0" w:before="0"/>
+              <w:jc w:val="center"/>
+            </w:pPr>
+            <w:r>
+              <w:rPr>
+                <w:rFonts w:ascii="Times New Roman" w:hAnsi="Times New Roman" w:eastAsia="宋体"/>
+                <w:sz w:val="17"/>
+              </w:rPr>
+            </w:r>
+          </w:p>
+        </w:tc>
+        <w:tc>
+          <w:tcPr>
+            <w:tcW w:type="dxa" w:w="1728"/>
+          </w:tcPr>
+          <w:p>
+            <w:pPr>
+              <w:spacing w:after="0" w:before="0"/>
+              <w:jc w:val="center"/>
+            </w:pPr>
+            <w:r>
+              <w:rPr>
+                <w:rFonts w:ascii="Times New Roman" w:hAnsi="Times New Roman" w:eastAsia="宋体"/>
+                <w:sz w:val="17"/>
+              </w:rPr>
+              <w:t>-0.149***</w:t>
+            </w:r>
+          </w:p>
+        </w:tc>
+        <w:tc>
+          <w:tcPr>
+            <w:tcW w:type="dxa" w:w="1728"/>
+          </w:tcPr>
+          <w:p>
+            <w:pPr>
+              <w:spacing w:after="0" w:before="0"/>
+              <w:jc w:val="center"/>
+            </w:pPr>
+            <w:r>
+              <w:rPr>
+                <w:rFonts w:ascii="Times New Roman" w:hAnsi="Times New Roman" w:eastAsia="宋体"/>
+                <w:sz w:val="17"/>
+              </w:rPr>
+            </w:r>
+          </w:p>
+        </w:tc>
+        <w:tc>
+          <w:tcPr>
+            <w:tcW w:type="dxa" w:w="1728"/>
+          </w:tcPr>
+          <w:p>
+            <w:pPr>
+              <w:spacing w:after="0" w:before="0"/>
+              <w:jc w:val="center"/>
+            </w:pPr>
+            <w:r>
+              <w:rPr>
+                <w:rFonts w:ascii="Times New Roman" w:hAnsi="Times New Roman" w:eastAsia="宋体"/>
+                <w:sz w:val="17"/>
+              </w:rPr>
             </w:r>
           </w:p>
         </w:tc>
@@ -6389,7 +6463,7 @@
       <w:tr>
         <w:tc>
           <w:tcPr>
-            <w:tcW w:type="dxa" w:w="2160"/>
+            <w:tcW w:type="dxa" w:w="1728"/>
           </w:tcPr>
           <w:p>
             <w:pPr>
@@ -6406,54 +6480,70 @@
         </w:tc>
         <w:tc>
           <w:tcPr>
-            <w:tcW w:type="dxa" w:w="2160"/>
-          </w:tcPr>
-          <w:p>
-            <w:pPr>
-              <w:spacing w:after="0" w:before="0"/>
-              <w:jc w:val="center"/>
-            </w:pPr>
-            <w:r>
-              <w:rPr>
-                <w:rFonts w:ascii="Times New Roman" w:hAnsi="Times New Roman" w:eastAsia="宋体"/>
-                <w:sz w:val="17"/>
-              </w:rPr>
-            </w:r>
-          </w:p>
-        </w:tc>
-        <w:tc>
-          <w:tcPr>
-            <w:tcW w:type="dxa" w:w="2160"/>
-          </w:tcPr>
-          <w:p>
-            <w:pPr>
-              <w:spacing w:after="0" w:before="0"/>
-              <w:jc w:val="center"/>
-            </w:pPr>
-            <w:r>
-              <w:rPr>
-                <w:rFonts w:ascii="Times New Roman" w:hAnsi="Times New Roman" w:eastAsia="宋体"/>
-                <w:sz w:val="17"/>
-              </w:rPr>
-              <w:t>(-1.014)</w:t>
-            </w:r>
-          </w:p>
-        </w:tc>
-        <w:tc>
-          <w:tcPr>
-            <w:tcW w:type="dxa" w:w="2160"/>
-          </w:tcPr>
-          <w:p>
-            <w:pPr>
-              <w:spacing w:after="0" w:before="0"/>
-              <w:jc w:val="center"/>
-            </w:pPr>
-            <w:r>
-              <w:rPr>
-                <w:rFonts w:ascii="Times New Roman" w:hAnsi="Times New Roman" w:eastAsia="宋体"/>
-                <w:sz w:val="17"/>
-              </w:rPr>
-              <w:t>(-1.363)</w:t>
+            <w:tcW w:type="dxa" w:w="1728"/>
+          </w:tcPr>
+          <w:p>
+            <w:pPr>
+              <w:spacing w:after="0" w:before="0"/>
+              <w:jc w:val="center"/>
+            </w:pPr>
+            <w:r>
+              <w:rPr>
+                <w:rFonts w:ascii="Times New Roman" w:hAnsi="Times New Roman" w:eastAsia="宋体"/>
+                <w:sz w:val="17"/>
+              </w:rPr>
+            </w:r>
+          </w:p>
+        </w:tc>
+        <w:tc>
+          <w:tcPr>
+            <w:tcW w:type="dxa" w:w="1728"/>
+          </w:tcPr>
+          <w:p>
+            <w:pPr>
+              <w:spacing w:after="0" w:before="0"/>
+              <w:jc w:val="center"/>
+            </w:pPr>
+            <w:r>
+              <w:rPr>
+                <w:rFonts w:ascii="Times New Roman" w:hAnsi="Times New Roman" w:eastAsia="宋体"/>
+                <w:sz w:val="17"/>
+              </w:rPr>
+              <w:t>(-3.941)</w:t>
+            </w:r>
+          </w:p>
+        </w:tc>
+        <w:tc>
+          <w:tcPr>
+            <w:tcW w:type="dxa" w:w="1728"/>
+          </w:tcPr>
+          <w:p>
+            <w:pPr>
+              <w:spacing w:after="0" w:before="0"/>
+              <w:jc w:val="center"/>
+            </w:pPr>
+            <w:r>
+              <w:rPr>
+                <w:rFonts w:ascii="Times New Roman" w:hAnsi="Times New Roman" w:eastAsia="宋体"/>
+                <w:sz w:val="17"/>
+              </w:rPr>
+            </w:r>
+          </w:p>
+        </w:tc>
+        <w:tc>
+          <w:tcPr>
+            <w:tcW w:type="dxa" w:w="1728"/>
+          </w:tcPr>
+          <w:p>
+            <w:pPr>
+              <w:spacing w:after="0" w:before="0"/>
+              <w:jc w:val="center"/>
+            </w:pPr>
+            <w:r>
+              <w:rPr>
+                <w:rFonts w:ascii="Times New Roman" w:hAnsi="Times New Roman" w:eastAsia="宋体"/>
+                <w:sz w:val="17"/>
+              </w:rPr>
             </w:r>
           </w:p>
         </w:tc>
@@ -6461,7 +6551,7 @@
       <w:tr>
         <w:tc>
           <w:tcPr>
-            <w:tcW w:type="dxa" w:w="2160"/>
+            <w:tcW w:type="dxa" w:w="1728"/>
           </w:tcPr>
           <w:p>
             <w:pPr>
@@ -6473,61 +6563,77 @@
                 <w:rFonts w:ascii="Times New Roman" w:hAnsi="Times New Roman" w:eastAsia="宋体"/>
                 <w:sz w:val="17"/>
               </w:rPr>
-              <w:t>控制变量</w:t>
-            </w:r>
-          </w:p>
-        </w:tc>
-        <w:tc>
-          <w:tcPr>
-            <w:tcW w:type="dxa" w:w="2160"/>
-          </w:tcPr>
-          <w:p>
-            <w:pPr>
-              <w:spacing w:after="0" w:before="0"/>
-              <w:jc w:val="center"/>
-            </w:pPr>
-            <w:r>
-              <w:rPr>
-                <w:rFonts w:ascii="Times New Roman" w:hAnsi="Times New Roman" w:eastAsia="宋体"/>
-                <w:sz w:val="17"/>
-              </w:rPr>
-              <w:t>是</w:t>
-            </w:r>
-          </w:p>
-        </w:tc>
-        <w:tc>
-          <w:tcPr>
-            <w:tcW w:type="dxa" w:w="2160"/>
-          </w:tcPr>
-          <w:p>
-            <w:pPr>
-              <w:spacing w:after="0" w:before="0"/>
-              <w:jc w:val="center"/>
-            </w:pPr>
-            <w:r>
-              <w:rPr>
-                <w:rFonts w:ascii="Times New Roman" w:hAnsi="Times New Roman" w:eastAsia="宋体"/>
-                <w:sz w:val="17"/>
-              </w:rPr>
-              <w:t>是</w:t>
-            </w:r>
-          </w:p>
-        </w:tc>
-        <w:tc>
-          <w:tcPr>
-            <w:tcW w:type="dxa" w:w="2160"/>
-          </w:tcPr>
-          <w:p>
-            <w:pPr>
-              <w:spacing w:after="0" w:before="0"/>
-              <w:jc w:val="center"/>
-            </w:pPr>
-            <w:r>
-              <w:rPr>
-                <w:rFonts w:ascii="Times New Roman" w:hAnsi="Times New Roman" w:eastAsia="宋体"/>
-                <w:sz w:val="17"/>
-              </w:rPr>
-              <w:t>是</w:t>
+              <w:t>4A政策(DID4A)</w:t>
+            </w:r>
+          </w:p>
+        </w:tc>
+        <w:tc>
+          <w:tcPr>
+            <w:tcW w:type="dxa" w:w="1728"/>
+          </w:tcPr>
+          <w:p>
+            <w:pPr>
+              <w:spacing w:after="0" w:before="0"/>
+              <w:jc w:val="center"/>
+            </w:pPr>
+            <w:r>
+              <w:rPr>
+                <w:rFonts w:ascii="Times New Roman" w:hAnsi="Times New Roman" w:eastAsia="宋体"/>
+                <w:sz w:val="17"/>
+              </w:rPr>
+            </w:r>
+          </w:p>
+        </w:tc>
+        <w:tc>
+          <w:tcPr>
+            <w:tcW w:type="dxa" w:w="1728"/>
+          </w:tcPr>
+          <w:p>
+            <w:pPr>
+              <w:spacing w:after="0" w:before="0"/>
+              <w:jc w:val="center"/>
+            </w:pPr>
+            <w:r>
+              <w:rPr>
+                <w:rFonts w:ascii="Times New Roman" w:hAnsi="Times New Roman" w:eastAsia="宋体"/>
+                <w:sz w:val="17"/>
+              </w:rPr>
+            </w:r>
+          </w:p>
+        </w:tc>
+        <w:tc>
+          <w:tcPr>
+            <w:tcW w:type="dxa" w:w="1728"/>
+          </w:tcPr>
+          <w:p>
+            <w:pPr>
+              <w:spacing w:after="0" w:before="0"/>
+              <w:jc w:val="center"/>
+            </w:pPr>
+            <w:r>
+              <w:rPr>
+                <w:rFonts w:ascii="Times New Roman" w:hAnsi="Times New Roman" w:eastAsia="宋体"/>
+                <w:sz w:val="17"/>
+              </w:rPr>
+              <w:t>-0.061</w:t>
+            </w:r>
+          </w:p>
+        </w:tc>
+        <w:tc>
+          <w:tcPr>
+            <w:tcW w:type="dxa" w:w="1728"/>
+          </w:tcPr>
+          <w:p>
+            <w:pPr>
+              <w:spacing w:after="0" w:before="0"/>
+              <w:jc w:val="center"/>
+            </w:pPr>
+            <w:r>
+              <w:rPr>
+                <w:rFonts w:ascii="Times New Roman" w:hAnsi="Times New Roman" w:eastAsia="宋体"/>
+                <w:sz w:val="17"/>
+              </w:rPr>
+              <w:t>-0.117</w:t>
             </w:r>
           </w:p>
         </w:tc>
@@ -6535,7 +6641,7 @@
       <w:tr>
         <w:tc>
           <w:tcPr>
-            <w:tcW w:type="dxa" w:w="2160"/>
+            <w:tcW w:type="dxa" w:w="1728"/>
           </w:tcPr>
           <w:p>
             <w:pPr>
@@ -6547,61 +6653,76 @@
                 <w:rFonts w:ascii="Times New Roman" w:hAnsi="Times New Roman" w:eastAsia="宋体"/>
                 <w:sz w:val="17"/>
               </w:rPr>
-              <w:t>城市固定效应</w:t>
-            </w:r>
-          </w:p>
-        </w:tc>
-        <w:tc>
-          <w:tcPr>
-            <w:tcW w:type="dxa" w:w="2160"/>
-          </w:tcPr>
-          <w:p>
-            <w:pPr>
-              <w:spacing w:after="0" w:before="0"/>
-              <w:jc w:val="center"/>
-            </w:pPr>
-            <w:r>
-              <w:rPr>
-                <w:rFonts w:ascii="Times New Roman" w:hAnsi="Times New Roman" w:eastAsia="宋体"/>
-                <w:sz w:val="17"/>
-              </w:rPr>
-              <w:t>是</w:t>
-            </w:r>
-          </w:p>
-        </w:tc>
-        <w:tc>
-          <w:tcPr>
-            <w:tcW w:type="dxa" w:w="2160"/>
-          </w:tcPr>
-          <w:p>
-            <w:pPr>
-              <w:spacing w:after="0" w:before="0"/>
-              <w:jc w:val="center"/>
-            </w:pPr>
-            <w:r>
-              <w:rPr>
-                <w:rFonts w:ascii="Times New Roman" w:hAnsi="Times New Roman" w:eastAsia="宋体"/>
-                <w:sz w:val="17"/>
-              </w:rPr>
-              <w:t>是</w:t>
-            </w:r>
-          </w:p>
-        </w:tc>
-        <w:tc>
-          <w:tcPr>
-            <w:tcW w:type="dxa" w:w="2160"/>
-          </w:tcPr>
-          <w:p>
-            <w:pPr>
-              <w:spacing w:after="0" w:before="0"/>
-              <w:jc w:val="center"/>
-            </w:pPr>
-            <w:r>
-              <w:rPr>
-                <w:rFonts w:ascii="Times New Roman" w:hAnsi="Times New Roman" w:eastAsia="宋体"/>
-                <w:sz w:val="17"/>
-              </w:rPr>
-              <w:t>是</w:t>
+            </w:r>
+          </w:p>
+        </w:tc>
+        <w:tc>
+          <w:tcPr>
+            <w:tcW w:type="dxa" w:w="1728"/>
+          </w:tcPr>
+          <w:p>
+            <w:pPr>
+              <w:spacing w:after="0" w:before="0"/>
+              <w:jc w:val="center"/>
+            </w:pPr>
+            <w:r>
+              <w:rPr>
+                <w:rFonts w:ascii="Times New Roman" w:hAnsi="Times New Roman" w:eastAsia="宋体"/>
+                <w:sz w:val="17"/>
+              </w:rPr>
+            </w:r>
+          </w:p>
+        </w:tc>
+        <w:tc>
+          <w:tcPr>
+            <w:tcW w:type="dxa" w:w="1728"/>
+          </w:tcPr>
+          <w:p>
+            <w:pPr>
+              <w:spacing w:after="0" w:before="0"/>
+              <w:jc w:val="center"/>
+            </w:pPr>
+            <w:r>
+              <w:rPr>
+                <w:rFonts w:ascii="Times New Roman" w:hAnsi="Times New Roman" w:eastAsia="宋体"/>
+                <w:sz w:val="17"/>
+              </w:rPr>
+            </w:r>
+          </w:p>
+        </w:tc>
+        <w:tc>
+          <w:tcPr>
+            <w:tcW w:type="dxa" w:w="1728"/>
+          </w:tcPr>
+          <w:p>
+            <w:pPr>
+              <w:spacing w:after="0" w:before="0"/>
+              <w:jc w:val="center"/>
+            </w:pPr>
+            <w:r>
+              <w:rPr>
+                <w:rFonts w:ascii="Times New Roman" w:hAnsi="Times New Roman" w:eastAsia="宋体"/>
+                <w:sz w:val="17"/>
+              </w:rPr>
+              <w:t>(-1.014)</w:t>
+            </w:r>
+          </w:p>
+        </w:tc>
+        <w:tc>
+          <w:tcPr>
+            <w:tcW w:type="dxa" w:w="1728"/>
+          </w:tcPr>
+          <w:p>
+            <w:pPr>
+              <w:spacing w:after="0" w:before="0"/>
+              <w:jc w:val="center"/>
+            </w:pPr>
+            <w:r>
+              <w:rPr>
+                <w:rFonts w:ascii="Times New Roman" w:hAnsi="Times New Roman" w:eastAsia="宋体"/>
+                <w:sz w:val="17"/>
+              </w:rPr>
+              <w:t>(-1.363)</w:t>
             </w:r>
           </w:p>
         </w:tc>
@@ -6609,7 +6730,7 @@
       <w:tr>
         <w:tc>
           <w:tcPr>
-            <w:tcW w:type="dxa" w:w="2160"/>
+            <w:tcW w:type="dxa" w:w="1728"/>
           </w:tcPr>
           <w:p>
             <w:pPr>
@@ -6621,13 +6742,13 @@
                 <w:rFonts w:ascii="Times New Roman" w:hAnsi="Times New Roman" w:eastAsia="宋体"/>
                 <w:sz w:val="17"/>
               </w:rPr>
-              <w:t>年份固定效应</w:t>
-            </w:r>
-          </w:p>
-        </w:tc>
-        <w:tc>
-          <w:tcPr>
-            <w:tcW w:type="dxa" w:w="2160"/>
+              <w:t>控制变量</w:t>
+            </w:r>
+          </w:p>
+        </w:tc>
+        <w:tc>
+          <w:tcPr>
+            <w:tcW w:type="dxa" w:w="1728"/>
           </w:tcPr>
           <w:p>
             <w:pPr>
@@ -6645,7 +6766,7 @@
         </w:tc>
         <w:tc>
           <w:tcPr>
-            <w:tcW w:type="dxa" w:w="2160"/>
+            <w:tcW w:type="dxa" w:w="1728"/>
           </w:tcPr>
           <w:p>
             <w:pPr>
@@ -6663,7 +6784,25 @@
         </w:tc>
         <w:tc>
           <w:tcPr>
-            <w:tcW w:type="dxa" w:w="2160"/>
+            <w:tcW w:type="dxa" w:w="1728"/>
+          </w:tcPr>
+          <w:p>
+            <w:pPr>
+              <w:spacing w:after="0" w:before="0"/>
+              <w:jc w:val="center"/>
+            </w:pPr>
+            <w:r>
+              <w:rPr>
+                <w:rFonts w:ascii="Times New Roman" w:hAnsi="Times New Roman" w:eastAsia="宋体"/>
+                <w:sz w:val="17"/>
+              </w:rPr>
+              <w:t>是</w:t>
+            </w:r>
+          </w:p>
+        </w:tc>
+        <w:tc>
+          <w:tcPr>
+            <w:tcW w:type="dxa" w:w="1728"/>
           </w:tcPr>
           <w:p>
             <w:pPr>
@@ -6683,7 +6822,7 @@
       <w:tr>
         <w:tc>
           <w:tcPr>
-            <w:tcW w:type="dxa" w:w="2160"/>
+            <w:tcW w:type="dxa" w:w="1728"/>
           </w:tcPr>
           <w:p>
             <w:pPr>
@@ -6695,61 +6834,79 @@
                 <w:rFonts w:ascii="Times New Roman" w:hAnsi="Times New Roman" w:eastAsia="宋体"/>
                 <w:sz w:val="17"/>
               </w:rPr>
-              <w:t>观测值N</w:t>
-            </w:r>
-          </w:p>
-        </w:tc>
-        <w:tc>
-          <w:tcPr>
-            <w:tcW w:type="dxa" w:w="2160"/>
-          </w:tcPr>
-          <w:p>
-            <w:pPr>
-              <w:spacing w:after="0" w:before="0"/>
-              <w:jc w:val="center"/>
-            </w:pPr>
-            <w:r>
-              <w:rPr>
-                <w:rFonts w:ascii="Times New Roman" w:hAnsi="Times New Roman" w:eastAsia="宋体"/>
-                <w:sz w:val="17"/>
-              </w:rPr>
-              <w:t>3843</w:t>
-            </w:r>
-          </w:p>
-        </w:tc>
-        <w:tc>
-          <w:tcPr>
-            <w:tcW w:type="dxa" w:w="2160"/>
-          </w:tcPr>
-          <w:p>
-            <w:pPr>
-              <w:spacing w:after="0" w:before="0"/>
-              <w:jc w:val="center"/>
-            </w:pPr>
-            <w:r>
-              <w:rPr>
-                <w:rFonts w:ascii="Times New Roman" w:hAnsi="Times New Roman" w:eastAsia="宋体"/>
-                <w:sz w:val="17"/>
-              </w:rPr>
-              <w:t>6069</w:t>
-            </w:r>
-          </w:p>
-        </w:tc>
-        <w:tc>
-          <w:tcPr>
-            <w:tcW w:type="dxa" w:w="2160"/>
-          </w:tcPr>
-          <w:p>
-            <w:pPr>
-              <w:spacing w:after="0" w:before="0"/>
-              <w:jc w:val="center"/>
-            </w:pPr>
-            <w:r>
-              <w:rPr>
-                <w:rFonts w:ascii="Times New Roman" w:hAnsi="Times New Roman" w:eastAsia="宋体"/>
-                <w:sz w:val="17"/>
-              </w:rPr>
-              <w:t>903</w:t>
+              <w:t>城市固定效应</w:t>
+            </w:r>
+          </w:p>
+        </w:tc>
+        <w:tc>
+          <w:tcPr>
+            <w:tcW w:type="dxa" w:w="1728"/>
+          </w:tcPr>
+          <w:p>
+            <w:pPr>
+              <w:spacing w:after="0" w:before="0"/>
+              <w:jc w:val="center"/>
+            </w:pPr>
+            <w:r>
+              <w:rPr>
+                <w:rFonts w:ascii="Times New Roman" w:hAnsi="Times New Roman" w:eastAsia="宋体"/>
+                <w:sz w:val="17"/>
+              </w:rPr>
+              <w:t>是</w:t>
+            </w:r>
+          </w:p>
+        </w:tc>
+        <w:tc>
+          <w:tcPr>
+            <w:tcW w:type="dxa" w:w="1728"/>
+          </w:tcPr>
+          <w:p>
+            <w:pPr>
+              <w:spacing w:after="0" w:before="0"/>
+              <w:jc w:val="center"/>
+            </w:pPr>
+            <w:r>
+              <w:rPr>
+                <w:rFonts w:ascii="Times New Roman" w:hAnsi="Times New Roman" w:eastAsia="宋体"/>
+                <w:sz w:val="17"/>
+              </w:rPr>
+              <w:t>是</w:t>
+            </w:r>
+          </w:p>
+        </w:tc>
+        <w:tc>
+          <w:tcPr>
+            <w:tcW w:type="dxa" w:w="1728"/>
+          </w:tcPr>
+          <w:p>
+            <w:pPr>
+              <w:spacing w:after="0" w:before="0"/>
+              <w:jc w:val="center"/>
+            </w:pPr>
+            <w:r>
+              <w:rPr>
+                <w:rFonts w:ascii="Times New Roman" w:hAnsi="Times New Roman" w:eastAsia="宋体"/>
+                <w:sz w:val="17"/>
+              </w:rPr>
+              <w:t>是</w:t>
+            </w:r>
+          </w:p>
+        </w:tc>
+        <w:tc>
+          <w:tcPr>
+            <w:tcW w:type="dxa" w:w="1728"/>
+          </w:tcPr>
+          <w:p>
+            <w:pPr>
+              <w:spacing w:after="0" w:before="0"/>
+              <w:jc w:val="center"/>
+            </w:pPr>
+            <w:r>
+              <w:rPr>
+                <w:rFonts w:ascii="Times New Roman" w:hAnsi="Times New Roman" w:eastAsia="宋体"/>
+                <w:sz w:val="17"/>
+              </w:rPr>
+              <w:t>是</w:t>
             </w:r>
           </w:p>
         </w:tc>
@@ -6757,7 +6914,191 @@
       <w:tr>
         <w:tc>
           <w:tcPr>
-            <w:tcW w:type="dxa" w:w="2160"/>
+            <w:tcW w:type="dxa" w:w="1728"/>
+          </w:tcPr>
+          <w:p>
+            <w:pPr>
+              <w:spacing w:after="0" w:before="0"/>
+              <w:jc w:val="left"/>
+            </w:pPr>
+            <w:r>
+              <w:rPr>
+                <w:rFonts w:ascii="Times New Roman" w:hAnsi="Times New Roman" w:eastAsia="宋体"/>
+                <w:sz w:val="17"/>
+              </w:rPr>
+              <w:t>年份固定效应</w:t>
+            </w:r>
+          </w:p>
+        </w:tc>
+        <w:tc>
+          <w:tcPr>
+            <w:tcW w:type="dxa" w:w="1728"/>
+          </w:tcPr>
+          <w:p>
+            <w:pPr>
+              <w:spacing w:after="0" w:before="0"/>
+              <w:jc w:val="center"/>
+            </w:pPr>
+            <w:r>
+              <w:rPr>
+                <w:rFonts w:ascii="Times New Roman" w:hAnsi="Times New Roman" w:eastAsia="宋体"/>
+                <w:sz w:val="17"/>
+              </w:rPr>
+              <w:t>是</w:t>
+            </w:r>
+          </w:p>
+        </w:tc>
+        <w:tc>
+          <w:tcPr>
+            <w:tcW w:type="dxa" w:w="1728"/>
+          </w:tcPr>
+          <w:p>
+            <w:pPr>
+              <w:spacing w:after="0" w:before="0"/>
+              <w:jc w:val="center"/>
+            </w:pPr>
+            <w:r>
+              <w:rPr>
+                <w:rFonts w:ascii="Times New Roman" w:hAnsi="Times New Roman" w:eastAsia="宋体"/>
+                <w:sz w:val="17"/>
+              </w:rPr>
+              <w:t>是</w:t>
+            </w:r>
+          </w:p>
+        </w:tc>
+        <w:tc>
+          <w:tcPr>
+            <w:tcW w:type="dxa" w:w="1728"/>
+          </w:tcPr>
+          <w:p>
+            <w:pPr>
+              <w:spacing w:after="0" w:before="0"/>
+              <w:jc w:val="center"/>
+            </w:pPr>
+            <w:r>
+              <w:rPr>
+                <w:rFonts w:ascii="Times New Roman" w:hAnsi="Times New Roman" w:eastAsia="宋体"/>
+                <w:sz w:val="17"/>
+              </w:rPr>
+              <w:t>是</w:t>
+            </w:r>
+          </w:p>
+        </w:tc>
+        <w:tc>
+          <w:tcPr>
+            <w:tcW w:type="dxa" w:w="1728"/>
+          </w:tcPr>
+          <w:p>
+            <w:pPr>
+              <w:spacing w:after="0" w:before="0"/>
+              <w:jc w:val="center"/>
+            </w:pPr>
+            <w:r>
+              <w:rPr>
+                <w:rFonts w:ascii="Times New Roman" w:hAnsi="Times New Roman" w:eastAsia="宋体"/>
+                <w:sz w:val="17"/>
+              </w:rPr>
+              <w:t>是</w:t>
+            </w:r>
+          </w:p>
+        </w:tc>
+      </w:tr>
+      <w:tr>
+        <w:tc>
+          <w:tcPr>
+            <w:tcW w:type="dxa" w:w="1728"/>
+          </w:tcPr>
+          <w:p>
+            <w:pPr>
+              <w:spacing w:after="0" w:before="0"/>
+              <w:jc w:val="left"/>
+            </w:pPr>
+            <w:r>
+              <w:rPr>
+                <w:rFonts w:ascii="Times New Roman" w:hAnsi="Times New Roman" w:eastAsia="宋体"/>
+                <w:sz w:val="17"/>
+              </w:rPr>
+              <w:t>观测值N</w:t>
+            </w:r>
+          </w:p>
+        </w:tc>
+        <w:tc>
+          <w:tcPr>
+            <w:tcW w:type="dxa" w:w="1728"/>
+          </w:tcPr>
+          <w:p>
+            <w:pPr>
+              <w:spacing w:after="0" w:before="0"/>
+              <w:jc w:val="center"/>
+            </w:pPr>
+            <w:r>
+              <w:rPr>
+                <w:rFonts w:ascii="Times New Roman" w:hAnsi="Times New Roman" w:eastAsia="宋体"/>
+                <w:sz w:val="17"/>
+              </w:rPr>
+              <w:t>3843</w:t>
+            </w:r>
+          </w:p>
+        </w:tc>
+        <w:tc>
+          <w:tcPr>
+            <w:tcW w:type="dxa" w:w="1728"/>
+          </w:tcPr>
+          <w:p>
+            <w:pPr>
+              <w:spacing w:after="0" w:before="0"/>
+              <w:jc w:val="center"/>
+            </w:pPr>
+            <w:r>
+              <w:rPr>
+                <w:rFonts w:ascii="Times New Roman" w:hAnsi="Times New Roman" w:eastAsia="宋体"/>
+                <w:sz w:val="17"/>
+              </w:rPr>
+              <w:t>6069</w:t>
+            </w:r>
+          </w:p>
+        </w:tc>
+        <w:tc>
+          <w:tcPr>
+            <w:tcW w:type="dxa" w:w="1728"/>
+          </w:tcPr>
+          <w:p>
+            <w:pPr>
+              <w:spacing w:after="0" w:before="0"/>
+              <w:jc w:val="center"/>
+            </w:pPr>
+            <w:r>
+              <w:rPr>
+                <w:rFonts w:ascii="Times New Roman" w:hAnsi="Times New Roman" w:eastAsia="宋体"/>
+                <w:sz w:val="17"/>
+              </w:rPr>
+              <w:t>6069</w:t>
+            </w:r>
+          </w:p>
+        </w:tc>
+        <w:tc>
+          <w:tcPr>
+            <w:tcW w:type="dxa" w:w="1728"/>
+          </w:tcPr>
+          <w:p>
+            <w:pPr>
+              <w:spacing w:after="0" w:before="0"/>
+              <w:jc w:val="center"/>
+            </w:pPr>
+            <w:r>
+              <w:rPr>
+                <w:rFonts w:ascii="Times New Roman" w:hAnsi="Times New Roman" w:eastAsia="宋体"/>
+                <w:sz w:val="17"/>
+              </w:rPr>
+              <w:t>903</w:t>
+            </w:r>
+          </w:p>
+        </w:tc>
+      </w:tr>
+      <w:tr>
+        <w:tc>
+          <w:tcPr>
+            <w:tcW w:type="dxa" w:w="1728"/>
             <w:tcBorders>
               <w:top w:val="nil"/>
               <w:bottom w:val="single" w:sz="14" w:color="000000"/>
@@ -6779,7 +7120,7 @@
         </w:tc>
         <w:tc>
           <w:tcPr>
-            <w:tcW w:type="dxa" w:w="2160"/>
+            <w:tcW w:type="dxa" w:w="1728"/>
             <w:tcBorders>
               <w:top w:val="nil"/>
               <w:bottom w:val="single" w:sz="14" w:color="000000"/>
@@ -6801,7 +7142,7 @@
         </w:tc>
         <w:tc>
           <w:tcPr>
-            <w:tcW w:type="dxa" w:w="2160"/>
+            <w:tcW w:type="dxa" w:w="1728"/>
             <w:tcBorders>
               <w:top w:val="nil"/>
               <w:bottom w:val="single" w:sz="14" w:color="000000"/>
@@ -6817,13 +7158,35 @@
                 <w:rFonts w:ascii="Times New Roman" w:hAnsi="Times New Roman" w:eastAsia="宋体"/>
                 <w:sz w:val="17"/>
               </w:rPr>
+              <w:t>0.063</w:t>
+            </w:r>
+          </w:p>
+        </w:tc>
+        <w:tc>
+          <w:tcPr>
+            <w:tcW w:type="dxa" w:w="1728"/>
+            <w:tcBorders>
+              <w:top w:val="nil"/>
+              <w:bottom w:val="single" w:sz="14" w:color="000000"/>
+            </w:tcBorders>
+          </w:tcPr>
+          <w:p>
+            <w:pPr>
+              <w:spacing w:after="0" w:before="0"/>
+              <w:jc w:val="center"/>
+            </w:pPr>
+            <w:r>
+              <w:rPr>
+                <w:rFonts w:ascii="Times New Roman" w:hAnsi="Times New Roman" w:eastAsia="宋体"/>
+                <w:sz w:val="17"/>
+              </w:rPr>
               <w:t>0.061</w:t>
             </w:r>
           </w:p>
         </w:tc>
         <w:tc>
           <w:tcPr>
-            <w:tcW w:type="dxa" w:w="2160"/>
+            <w:tcW w:type="dxa" w:w="1728"/>
             <w:tcBorders>
               <w:top w:val="nil"/>
               <w:bottom w:val="single" w:sz="14" w:color="000000"/>
@@ -6851,7 +7214,7 @@
           <w:i/>
           <w:sz w:val="16"/>
         </w:rPr>
-        <w:t>注：列(2)将核心解释变量由5A(DID)直接换成4A(DID4A);列(3)剔除“有4A无时点”城市作干净对照。4A方向与5A一致但偏弱不显著(时点仅覆盖41市+4A为次级品牌),恰支持效应特定于顶级5A。参照：He et al.(2025,JUE)。</w:t>
+        <w:t>注：列(2)把核心解释变量换成“5A累计数量强度”ln(1+城市累计5A数)——现有num5a_new为占位(仅首评年=1),累计后≈二值post,故系数−0.149***≈基准的等比例缩放,尚非真正的“剂量-反应”强度DID(并入真实逐年新增5A数量后方为完整强度DID);列(3)(4)为4A替换(全样本/干净对照),方向与5A一致但偏弱不显著,支持效应特定于顶级5A。参照：Callaway &amp; Sant’Anna(2021)剂量DID;He et al.(2025,JUE)。</w:t>
       </w:r>
     </w:p>
     <w:p/>

</xml_diff>